<commit_message>
Move to Qt6 using PySide
* Map data now cached locally, I see no reason to download static data on application load
* Map huc and climate layers load in async as well as point datasets
* Remove settings.conf, this is a per user conf file not a Git repo item
* Remove profile.json and profile.html, again these are not Git repo items
</commit_message>
<xml_diff>
--- a/Documentation/PyForecast_SQLite_Tables.docx
+++ b/Documentation/PyForecast_SQLite_Tables.docx
@@ -3870,13 +3870,7 @@
       </w:r>
       <w:proofErr w:type="spellStart"/>
       <w:r>
-        <w:t>saved_models_predit</w:t>
-      </w:r>
-      <w:r>
-        <w:t>ors_</w:t>
-      </w:r>
-      <w:r>
-        <w:t>data</w:t>
+        <w:t>saved_models_preditors_data</w:t>
       </w:r>
       <w:proofErr w:type="spellEnd"/>
       <w:r>

</xml_diff>